<commit_message>
ativacao: ordena resultados por data de criacao nos cards CC; atualiza robos e configs
- ativacao.py: ordena arquivos de resultado por st_ctime (data criacao) decrescente nos cards Omni, Bradesco e Daycoval CC
- bradesco/omni/omni-pde CC main.py: atualizacoes de fluxo
- cpj-reembolso-bmg main.py: melhorias na logica de busca
- lancamento-prepostos main.py: atualizacoes iFood e Daycoval
- configs: bradesco CC, daycoval CC, omni CC, omni-pde, lancamento-prepostos iFood atualizados
- documentos padrao: atualizados BMG e iFood

Co-Authored-By: Claude Sonnet 4.6 <noreply@anthropic.com>
</commit_message>
<xml_diff>
--- a/sites/lancamento-prepostos/documentos_padrao/banco_bmg/descritivo_padrao.docx
+++ b/sites/lancamento-prepostos/documentos_padrao/banco_bmg/descritivo_padrao.docx
@@ -168,7 +168,7 @@
           </w:tcPr>
           <w:p>
             <w:r>
-              <w:t>180131</w:t>
+              <w:t>180605</w:t>
             </w:r>
           </w:p>
         </w:tc>
@@ -212,7 +212,7 @@
           </w:tcPr>
           <w:p>
             <w:r>
-              <w:t>06/07/2026</w:t>
+              <w:t>16/07/2026</w:t>
             </w:r>
           </w:p>
         </w:tc>
@@ -412,7 +412,7 @@
           </w:tcPr>
           <w:p>
             <w:r>
-              <w:t>R$ 375,00</w:t>
+              <w:t>R$ 675,00</w:t>
             </w:r>
           </w:p>
         </w:tc>
@@ -1147,7 +1147,7 @@
           </w:tcPr>
           <w:p>
             <w:r>
-              <w:t>06/07/2026</w:t>
+              <w:t>14/07/2026</w:t>
             </w:r>
           </w:p>
         </w:tc>
@@ -1157,7 +1157,7 @@
           </w:tcPr>
           <w:p>
             <w:r>
-              <w:t>CIV1736773</w:t>
+              <w:t>CIV1747709</w:t>
             </w:r>
           </w:p>
         </w:tc>
@@ -1216,7 +1216,7 @@
           </w:tcPr>
           <w:p>
             <w:r>
-              <w:t>06/07/2026</w:t>
+              <w:t>14/07/2026</w:t>
             </w:r>
           </w:p>
         </w:tc>
@@ -1226,7 +1226,7 @@
           </w:tcPr>
           <w:p>
             <w:r>
-              <w:t>CIV1677020</w:t>
+              <w:t>CIV1510396</w:t>
             </w:r>
           </w:p>
         </w:tc>
@@ -1286,7 +1286,7 @@
           </w:tcPr>
           <w:p>
             <w:r>
-              <w:t>06/07/2026</w:t>
+              <w:t>14/07/2026</w:t>
             </w:r>
           </w:p>
         </w:tc>
@@ -1296,7 +1296,7 @@
           </w:tcPr>
           <w:p>
             <w:r>
-              <w:t>CIV1724198</w:t>
+              <w:t>CIV1707282</w:t>
             </w:r>
           </w:p>
         </w:tc>
@@ -1355,7 +1355,7 @@
           </w:tcPr>
           <w:p>
             <w:r>
-              <w:t>06/07/2026</w:t>
+              <w:t>14/07/2026</w:t>
             </w:r>
           </w:p>
         </w:tc>
@@ -1365,7 +1365,7 @@
           </w:tcPr>
           <w:p>
             <w:r>
-              <w:t>CIV1509200</w:t>
+              <w:t>CIV1677338</w:t>
             </w:r>
           </w:p>
         </w:tc>
@@ -1425,7 +1425,7 @@
           </w:tcPr>
           <w:p>
             <w:r>
-              <w:t>06/07/2026</w:t>
+              <w:t>14/07/2026</w:t>
             </w:r>
           </w:p>
         </w:tc>
@@ -1435,7 +1435,7 @@
           </w:tcPr>
           <w:p>
             <w:r>
-              <w:t>CIV1725694</w:t>
+              <w:t>CIV1569001</w:t>
             </w:r>
           </w:p>
         </w:tc>
@@ -1492,13 +1492,21 @@
           <w:tcPr>
             <w:tcW w:w="2170" w:type="dxa"/>
           </w:tcPr>
-          <w:p/>
+          <w:p>
+            <w:r>
+              <w:t>14/07/2026</w:t>
+            </w:r>
+          </w:p>
         </w:tc>
         <w:tc>
           <w:tcPr>
             <w:tcW w:w="1560" w:type="dxa"/>
           </w:tcPr>
-          <w:p/>
+          <w:p>
+            <w:r>
+              <w:t>CIV1712983</w:t>
+            </w:r>
+          </w:p>
         </w:tc>
         <w:tc>
           <w:tcPr>
@@ -1525,9 +1533,9 @@
             <w:shd w:val="clear" w:color="auto" w:fill="FBE2D1"/>
           </w:tcPr>
           <w:p>
-            <w:pPr>
-              <w:jc w:val="center"/>
-            </w:pPr>
+            <w:r>
+              <w:t>75,00</w:t>
+            </w:r>
           </w:p>
         </w:tc>
       </w:tr>
@@ -1554,13 +1562,21 @@
           <w:tcPr>
             <w:tcW w:w="2170" w:type="dxa"/>
           </w:tcPr>
-          <w:p/>
+          <w:p>
+            <w:r>
+              <w:t>14/07/2026</w:t>
+            </w:r>
+          </w:p>
         </w:tc>
         <w:tc>
           <w:tcPr>
             <w:tcW w:w="1560" w:type="dxa"/>
           </w:tcPr>
-          <w:p/>
+          <w:p>
+            <w:r>
+              <w:t>CIV1744515</w:t>
+            </w:r>
+          </w:p>
         </w:tc>
         <w:tc>
           <w:tcPr>
@@ -1587,9 +1603,9 @@
             <w:shd w:val="clear" w:color="auto" w:fill="FBE2D1"/>
           </w:tcPr>
           <w:p>
-            <w:pPr>
-              <w:jc w:val="center"/>
-            </w:pPr>
+            <w:r>
+              <w:t>75,00</w:t>
+            </w:r>
           </w:p>
         </w:tc>
       </w:tr>
@@ -1615,13 +1631,21 @@
           <w:tcPr>
             <w:tcW w:w="2170" w:type="dxa"/>
           </w:tcPr>
-          <w:p/>
+          <w:p>
+            <w:r>
+              <w:t>14/07/2026</w:t>
+            </w:r>
+          </w:p>
         </w:tc>
         <w:tc>
           <w:tcPr>
             <w:tcW w:w="1560" w:type="dxa"/>
           </w:tcPr>
-          <w:p/>
+          <w:p>
+            <w:r>
+              <w:t>CIV1709887</w:t>
+            </w:r>
+          </w:p>
         </w:tc>
         <w:tc>
           <w:tcPr>
@@ -1648,9 +1672,9 @@
             <w:shd w:val="clear" w:color="auto" w:fill="FBE2D1"/>
           </w:tcPr>
           <w:p>
-            <w:pPr>
-              <w:jc w:val="center"/>
-            </w:pPr>
+            <w:r>
+              <w:t>75,00</w:t>
+            </w:r>
           </w:p>
         </w:tc>
       </w:tr>
@@ -1677,13 +1701,21 @@
           <w:tcPr>
             <w:tcW w:w="2170" w:type="dxa"/>
           </w:tcPr>
-          <w:p/>
+          <w:p>
+            <w:r>
+              <w:t>14/07/2026</w:t>
+            </w:r>
+          </w:p>
         </w:tc>
         <w:tc>
           <w:tcPr>
             <w:tcW w:w="1560" w:type="dxa"/>
           </w:tcPr>
-          <w:p/>
+          <w:p>
+            <w:r>
+              <w:t>CIV1740997</w:t>
+            </w:r>
+          </w:p>
         </w:tc>
         <w:tc>
           <w:tcPr>
@@ -1710,9 +1742,9 @@
             <w:shd w:val="clear" w:color="auto" w:fill="FBE2D1"/>
           </w:tcPr>
           <w:p>
-            <w:pPr>
-              <w:jc w:val="center"/>
-            </w:pPr>
+            <w:r>
+              <w:t>75,00</w:t>
+            </w:r>
           </w:p>
         </w:tc>
       </w:tr>
@@ -4288,7 +4320,7 @@
           </w:tcPr>
           <w:p>
             <w:r>
-              <w:t>R$ 375,00</w:t>
+              <w:t>R$ 675,00</w:t>
             </w:r>
           </w:p>
         </w:tc>

</xml_diff>

<commit_message>
feat: adiciona robo Claro CC, ativacao por temas/toggle, refatora lancamento-prepostos
- Novo robo claro-conciliacao-conta-corrente (config, main, ProcessoClaro, ativacao.py, modal)
- Painel /ativacao organizado por categorias colapsaveis com toggle/localStorage/busca
- Categorias: Reembolsos, Eventos Faturamento, Conciliacao CC, Lancamento Prepostos
- Barra de secao com cor #0f172b, chevron e contador de robos
- Busca revela cards em secoes colapsadas; limpar restaura estado anterior
- lancamento-prepostos: main.py refatorado em main_bmg/daycoval/ifood separados
- Resultados JSON de bradesco/daycoval/omni conciliacao CC adicionados

Co-Authored-By: Claude Sonnet 4.6 <noreply@anthropic.com>
</commit_message>
<xml_diff>
--- a/sites/lancamento-prepostos/documentos_padrao/banco_bmg/descritivo_padrao.docx
+++ b/sites/lancamento-prepostos/documentos_padrao/banco_bmg/descritivo_padrao.docx
@@ -168,7 +168,7 @@
           </w:tcPr>
           <w:p>
             <w:r>
-              <w:t>180605</w:t>
+              <w:t>180131</w:t>
             </w:r>
           </w:p>
         </w:tc>
@@ -212,7 +212,7 @@
           </w:tcPr>
           <w:p>
             <w:r>
-              <w:t>16/07/2026</w:t>
+              <w:t>23/07/2026</w:t>
             </w:r>
           </w:p>
         </w:tc>
@@ -412,7 +412,7 @@
           </w:tcPr>
           <w:p>
             <w:r>
-              <w:t>R$ 675,00</w:t>
+              <w:t>R$ 375,00</w:t>
             </w:r>
           </w:p>
         </w:tc>
@@ -1147,7 +1147,7 @@
           </w:tcPr>
           <w:p>
             <w:r>
-              <w:t>14/07/2026</w:t>
+              <w:t>06/07/2026</w:t>
             </w:r>
           </w:p>
         </w:tc>
@@ -1157,7 +1157,7 @@
           </w:tcPr>
           <w:p>
             <w:r>
-              <w:t>CIV1747709</w:t>
+              <w:t>CIV1736773</w:t>
             </w:r>
           </w:p>
         </w:tc>
@@ -1216,7 +1216,7 @@
           </w:tcPr>
           <w:p>
             <w:r>
-              <w:t>14/07/2026</w:t>
+              <w:t>06/07/2026</w:t>
             </w:r>
           </w:p>
         </w:tc>
@@ -1226,7 +1226,7 @@
           </w:tcPr>
           <w:p>
             <w:r>
-              <w:t>CIV1510396</w:t>
+              <w:t>CIV1677020</w:t>
             </w:r>
           </w:p>
         </w:tc>
@@ -1286,7 +1286,7 @@
           </w:tcPr>
           <w:p>
             <w:r>
-              <w:t>14/07/2026</w:t>
+              <w:t>06/07/2026</w:t>
             </w:r>
           </w:p>
         </w:tc>
@@ -1296,7 +1296,7 @@
           </w:tcPr>
           <w:p>
             <w:r>
-              <w:t>CIV1707282</w:t>
+              <w:t>CIV1724198</w:t>
             </w:r>
           </w:p>
         </w:tc>
@@ -1355,7 +1355,7 @@
           </w:tcPr>
           <w:p>
             <w:r>
-              <w:t>14/07/2026</w:t>
+              <w:t>06/07/2026</w:t>
             </w:r>
           </w:p>
         </w:tc>
@@ -1365,7 +1365,7 @@
           </w:tcPr>
           <w:p>
             <w:r>
-              <w:t>CIV1677338</w:t>
+              <w:t>CIV1509200</w:t>
             </w:r>
           </w:p>
         </w:tc>
@@ -1425,7 +1425,7 @@
           </w:tcPr>
           <w:p>
             <w:r>
-              <w:t>14/07/2026</w:t>
+              <w:t>06/07/2026</w:t>
             </w:r>
           </w:p>
         </w:tc>
@@ -1435,7 +1435,7 @@
           </w:tcPr>
           <w:p>
             <w:r>
-              <w:t>CIV1569001</w:t>
+              <w:t>CIV1725694</w:t>
             </w:r>
           </w:p>
         </w:tc>
@@ -1492,21 +1492,13 @@
           <w:tcPr>
             <w:tcW w:w="2170" w:type="dxa"/>
           </w:tcPr>
-          <w:p>
-            <w:r>
-              <w:t>14/07/2026</w:t>
-            </w:r>
-          </w:p>
+          <w:p/>
         </w:tc>
         <w:tc>
           <w:tcPr>
             <w:tcW w:w="1560" w:type="dxa"/>
           </w:tcPr>
-          <w:p>
-            <w:r>
-              <w:t>CIV1712983</w:t>
-            </w:r>
-          </w:p>
+          <w:p/>
         </w:tc>
         <w:tc>
           <w:tcPr>
@@ -1533,9 +1525,9 @@
             <w:shd w:val="clear" w:color="auto" w:fill="FBE2D1"/>
           </w:tcPr>
           <w:p>
-            <w:r>
-              <w:t>75,00</w:t>
-            </w:r>
+            <w:pPr>
+              <w:jc w:val="center"/>
+            </w:pPr>
           </w:p>
         </w:tc>
       </w:tr>
@@ -1562,21 +1554,13 @@
           <w:tcPr>
             <w:tcW w:w="2170" w:type="dxa"/>
           </w:tcPr>
-          <w:p>
-            <w:r>
-              <w:t>14/07/2026</w:t>
-            </w:r>
-          </w:p>
+          <w:p/>
         </w:tc>
         <w:tc>
           <w:tcPr>
             <w:tcW w:w="1560" w:type="dxa"/>
           </w:tcPr>
-          <w:p>
-            <w:r>
-              <w:t>CIV1744515</w:t>
-            </w:r>
-          </w:p>
+          <w:p/>
         </w:tc>
         <w:tc>
           <w:tcPr>
@@ -1603,9 +1587,9 @@
             <w:shd w:val="clear" w:color="auto" w:fill="FBE2D1"/>
           </w:tcPr>
           <w:p>
-            <w:r>
-              <w:t>75,00</w:t>
-            </w:r>
+            <w:pPr>
+              <w:jc w:val="center"/>
+            </w:pPr>
           </w:p>
         </w:tc>
       </w:tr>
@@ -1631,21 +1615,13 @@
           <w:tcPr>
             <w:tcW w:w="2170" w:type="dxa"/>
           </w:tcPr>
-          <w:p>
-            <w:r>
-              <w:t>14/07/2026</w:t>
-            </w:r>
-          </w:p>
+          <w:p/>
         </w:tc>
         <w:tc>
           <w:tcPr>
             <w:tcW w:w="1560" w:type="dxa"/>
           </w:tcPr>
-          <w:p>
-            <w:r>
-              <w:t>CIV1709887</w:t>
-            </w:r>
-          </w:p>
+          <w:p/>
         </w:tc>
         <w:tc>
           <w:tcPr>
@@ -1672,9 +1648,9 @@
             <w:shd w:val="clear" w:color="auto" w:fill="FBE2D1"/>
           </w:tcPr>
           <w:p>
-            <w:r>
-              <w:t>75,00</w:t>
-            </w:r>
+            <w:pPr>
+              <w:jc w:val="center"/>
+            </w:pPr>
           </w:p>
         </w:tc>
       </w:tr>
@@ -1701,21 +1677,13 @@
           <w:tcPr>
             <w:tcW w:w="2170" w:type="dxa"/>
           </w:tcPr>
-          <w:p>
-            <w:r>
-              <w:t>14/07/2026</w:t>
-            </w:r>
-          </w:p>
+          <w:p/>
         </w:tc>
         <w:tc>
           <w:tcPr>
             <w:tcW w:w="1560" w:type="dxa"/>
           </w:tcPr>
-          <w:p>
-            <w:r>
-              <w:t>CIV1740997</w:t>
-            </w:r>
-          </w:p>
+          <w:p/>
         </w:tc>
         <w:tc>
           <w:tcPr>
@@ -1742,9 +1710,9 @@
             <w:shd w:val="clear" w:color="auto" w:fill="FBE2D1"/>
           </w:tcPr>
           <w:p>
-            <w:r>
-              <w:t>75,00</w:t>
-            </w:r>
+            <w:pPr>
+              <w:jc w:val="center"/>
+            </w:pPr>
           </w:p>
         </w:tc>
       </w:tr>
@@ -4320,7 +4288,7 @@
           </w:tcPr>
           <w:p>
             <w:r>
-              <w:t>R$ 675,00</w:t>
+              <w:t>R$ 375,00</w:t>
             </w:r>
           </w:p>
         </w:tc>

</xml_diff>